<commit_message>
Adding name on docx (aws)
</commit_message>
<xml_diff>
--- a/exams/aws/AWS Exam feb 2025.docx
+++ b/exams/aws/AWS Exam feb 2025.docx
@@ -12,7 +12,11 @@
       <w:bookmarkEnd w:id="0"/>
       <w:r>
         <w:rPr/>
-        <w:t>AWS Exam - 3 Hours</w:t>
+        <w:t xml:space="preserve">AWS Exam - 3 Hours </w:t>
+      </w:r>
+      <w:r>
+        <w:rPr/>
+        <w:t>(Almog Madar - 311555288)</w:t>
       </w:r>
     </w:p>
     <w:p>
@@ -4582,7 +4586,11 @@
         </w:rPr>
       </w:pPr>
       <w:r>
-        <w:rPr/>
+        <w:rPr>
+          <w:sz w:val="20"/>
+          <w:szCs w:val="20"/>
+          <w:u w:val="single"/>
+        </w:rPr>
       </w:r>
     </w:p>
     <w:p>
@@ -4737,12 +4745,6 @@
         </w:rPr>
       </w:pPr>
       <w:r>
-        <w:rPr>
-          <w:b/>
-          <w:color w:val="000000"/>
-          <w:sz w:val="26"/>
-          <w:szCs w:val="26"/>
-        </w:rPr>
         <w:drawing>
           <wp:anchor behindDoc="0" distT="0" distB="0" distL="0" distR="0" simplePos="0" locked="0" layoutInCell="1" allowOverlap="1" relativeHeight="13">
             <wp:simplePos x="0" y="0"/>
@@ -7781,14 +7783,6 @@
           <w:szCs w:val="26"/>
         </w:rPr>
         <w:tab/>
-      </w:r>
-      <w:r>
-        <w:rPr>
-          <w:b/>
-          <w:color w:val="000000"/>
-          <w:sz w:val="26"/>
-          <w:szCs w:val="26"/>
-        </w:rPr>
         <w:t>setup autoscaling group and launch template:</w:t>
       </w:r>
     </w:p>
@@ -7890,7 +7884,12 @@
         </w:rPr>
       </w:pPr>
       <w:r>
-        <w:rPr/>
+        <w:rPr>
+          <w:b/>
+          <w:color w:val="000000"/>
+          <w:sz w:val="26"/>
+          <w:szCs w:val="26"/>
+        </w:rPr>
         <w:drawing>
           <wp:anchor behindDoc="0" distT="0" distB="0" distL="0" distR="0" simplePos="0" locked="0" layoutInCell="1" allowOverlap="1" relativeHeight="28">
             <wp:simplePos x="0" y="0"/>
@@ -7951,7 +7950,12 @@
         </w:rPr>
       </w:pPr>
       <w:r>
-        <w:rPr/>
+        <w:rPr>
+          <w:b/>
+          <w:color w:val="000000"/>
+          <w:sz w:val="26"/>
+          <w:szCs w:val="26"/>
+        </w:rPr>
       </w:r>
     </w:p>
     <w:p>
@@ -7966,7 +7970,12 @@
         </w:rPr>
       </w:pPr>
       <w:r>
-        <w:rPr/>
+        <w:rPr>
+          <w:b/>
+          <w:color w:val="000000"/>
+          <w:sz w:val="26"/>
+          <w:szCs w:val="26"/>
+        </w:rPr>
       </w:r>
     </w:p>
     <w:p>
@@ -7981,7 +7990,12 @@
         </w:rPr>
       </w:pPr>
       <w:r>
-        <w:rPr/>
+        <w:rPr>
+          <w:b/>
+          <w:color w:val="000000"/>
+          <w:sz w:val="26"/>
+          <w:szCs w:val="26"/>
+        </w:rPr>
       </w:r>
     </w:p>
     <w:p>
@@ -7996,7 +8010,12 @@
         </w:rPr>
       </w:pPr>
       <w:r>
-        <w:rPr/>
+        <w:rPr>
+          <w:b/>
+          <w:color w:val="000000"/>
+          <w:sz w:val="26"/>
+          <w:szCs w:val="26"/>
+        </w:rPr>
       </w:r>
     </w:p>
     <w:p>
@@ -8011,7 +8030,12 @@
         </w:rPr>
       </w:pPr>
       <w:r>
-        <w:rPr/>
+        <w:rPr>
+          <w:b/>
+          <w:color w:val="000000"/>
+          <w:sz w:val="26"/>
+          <w:szCs w:val="26"/>
+        </w:rPr>
       </w:r>
     </w:p>
     <w:p>
@@ -8026,7 +8050,12 @@
         </w:rPr>
       </w:pPr>
       <w:r>
-        <w:rPr/>
+        <w:rPr>
+          <w:b/>
+          <w:color w:val="000000"/>
+          <w:sz w:val="26"/>
+          <w:szCs w:val="26"/>
+        </w:rPr>
       </w:r>
     </w:p>
     <w:p>
@@ -8041,7 +8070,12 @@
         </w:rPr>
       </w:pPr>
       <w:r>
-        <w:rPr/>
+        <w:rPr>
+          <w:b/>
+          <w:color w:val="000000"/>
+          <w:sz w:val="26"/>
+          <w:szCs w:val="26"/>
+        </w:rPr>
       </w:r>
     </w:p>
     <w:p>

</xml_diff>